<commit_message>
Modified: TODO comments to all the classes that require work from the student.
Added: WeatherDisplay class. This extra class adds some extra challenge by applying the basic principles of OOP.

Modified: Assignment document. Version control is described inside this document.
</commit_message>
<xml_diff>
--- a/ObserverPattern/API 3 - 002 - Observer Pattern.docx
+++ b/ObserverPattern/API 3 - 002 - Observer Pattern.docx
@@ -13,24 +13,12 @@
       <w:r>
         <w:t xml:space="preserve">API 3 – </w:t>
       </w:r>
-      <w:proofErr w:type="spellStart"/>
       <w:r>
         <w:t>Observer</w:t>
       </w:r>
-      <w:proofErr w:type="spellEnd"/>
       <w:r>
-        <w:t xml:space="preserve"> </w:t>
+        <w:t xml:space="preserve"> Pattern</w:t>
       </w:r>
-      <w:proofErr w:type="spellStart"/>
-      <w:r>
-        <w:t>Pattern</w:t>
-      </w:r>
-      <w:proofErr w:type="spellEnd"/>
-    </w:p>
-    <w:p>
-      <w:pPr>
-        <w:pStyle w:val="Lijstalinea"/>
-      </w:pPr>
     </w:p>
     <w:p>
       <w:r>
@@ -43,13 +31,14 @@
     <w:tbl>
       <w:tblPr>
         <w:tblStyle w:val="Tabelraster"/>
-        <w:tblW w:w="0" w:type="auto"/>
+        <w:tblW w:w="5000" w:type="pct"/>
         <w:tblLook w:val="04A0" w:firstRow="1" w:lastRow="0" w:firstColumn="1" w:lastColumn="0" w:noHBand="0" w:noVBand="1"/>
       </w:tblPr>
       <w:tblGrid>
-        <w:gridCol w:w="1271"/>
-        <w:gridCol w:w="2410"/>
-        <w:gridCol w:w="5947"/>
+        <w:gridCol w:w="901"/>
+        <w:gridCol w:w="2049"/>
+        <w:gridCol w:w="1945"/>
+        <w:gridCol w:w="4733"/>
       </w:tblGrid>
       <w:tr>
         <w:trPr>
@@ -57,8 +46,135 @@
         </w:trPr>
         <w:tc>
           <w:tcPr>
-            <w:tcW w:w="1271" w:type="dxa"/>
+            <w:tcW w:w="468" w:type="pct"/>
+            <w:tcBorders>
+              <w:top w:val="single" w:sz="4" w:space="0" w:color="auto"/>
+              <w:left w:val="single" w:sz="4" w:space="0" w:color="auto"/>
+              <w:bottom w:val="single" w:sz="4" w:space="0" w:color="auto"/>
+              <w:right w:val="single" w:sz="4" w:space="0" w:color="auto"/>
+            </w:tcBorders>
             <w:vAlign w:val="center"/>
+            <w:hideMark/>
+          </w:tcPr>
+          <w:p>
+            <w:pPr>
+              <w:pStyle w:val="Plattetekst"/>
+              <w:rPr>
+                <w:b/>
+                <w:bCs/>
+              </w:rPr>
+            </w:pPr>
+            <w:r>
+              <w:rPr>
+                <w:b/>
+                <w:bCs/>
+              </w:rPr>
+              <w:t>Versie</w:t>
+            </w:r>
+          </w:p>
+        </w:tc>
+        <w:tc>
+          <w:tcPr>
+            <w:tcW w:w="1064" w:type="pct"/>
+            <w:tcBorders>
+              <w:top w:val="single" w:sz="4" w:space="0" w:color="auto"/>
+              <w:left w:val="single" w:sz="4" w:space="0" w:color="auto"/>
+              <w:bottom w:val="single" w:sz="4" w:space="0" w:color="auto"/>
+              <w:right w:val="single" w:sz="4" w:space="0" w:color="auto"/>
+            </w:tcBorders>
+            <w:hideMark/>
+          </w:tcPr>
+          <w:p>
+            <w:pPr>
+              <w:pStyle w:val="Plattetekst"/>
+              <w:rPr>
+                <w:b/>
+                <w:bCs/>
+              </w:rPr>
+            </w:pPr>
+            <w:r>
+              <w:rPr>
+                <w:b/>
+                <w:bCs/>
+              </w:rPr>
+              <w:t>Datum verandering</w:t>
+            </w:r>
+          </w:p>
+        </w:tc>
+        <w:tc>
+          <w:tcPr>
+            <w:tcW w:w="1010" w:type="pct"/>
+            <w:tcBorders>
+              <w:top w:val="single" w:sz="4" w:space="0" w:color="auto"/>
+              <w:left w:val="single" w:sz="4" w:space="0" w:color="auto"/>
+              <w:bottom w:val="single" w:sz="4" w:space="0" w:color="auto"/>
+              <w:right w:val="single" w:sz="4" w:space="0" w:color="auto"/>
+            </w:tcBorders>
+            <w:vAlign w:val="center"/>
+            <w:hideMark/>
+          </w:tcPr>
+          <w:p>
+            <w:pPr>
+              <w:pStyle w:val="Plattetekst"/>
+              <w:rPr>
+                <w:b/>
+                <w:bCs/>
+              </w:rPr>
+            </w:pPr>
+            <w:r>
+              <w:rPr>
+                <w:b/>
+                <w:bCs/>
+              </w:rPr>
+              <w:t>Auteur</w:t>
+            </w:r>
+          </w:p>
+        </w:tc>
+        <w:tc>
+          <w:tcPr>
+            <w:tcW w:w="2459" w:type="pct"/>
+            <w:tcBorders>
+              <w:top w:val="single" w:sz="4" w:space="0" w:color="auto"/>
+              <w:left w:val="single" w:sz="4" w:space="0" w:color="auto"/>
+              <w:bottom w:val="single" w:sz="4" w:space="0" w:color="auto"/>
+              <w:right w:val="single" w:sz="4" w:space="0" w:color="auto"/>
+            </w:tcBorders>
+            <w:vAlign w:val="center"/>
+            <w:hideMark/>
+          </w:tcPr>
+          <w:p>
+            <w:pPr>
+              <w:pStyle w:val="Plattetekst"/>
+              <w:rPr>
+                <w:b/>
+                <w:bCs/>
+              </w:rPr>
+            </w:pPr>
+            <w:r>
+              <w:rPr>
+                <w:b/>
+                <w:bCs/>
+              </w:rPr>
+              <w:t>Opmerking</w:t>
+            </w:r>
+          </w:p>
+        </w:tc>
+      </w:tr>
+      <w:tr>
+        <w:trPr>
+          <w:trHeight w:val="180"/>
+        </w:trPr>
+        <w:tc>
+          <w:tcPr>
+            <w:tcW w:w="468" w:type="pct"/>
+            <w:tcBorders>
+              <w:top w:val="single" w:sz="4" w:space="0" w:color="auto"/>
+              <w:left w:val="single" w:sz="4" w:space="0" w:color="auto"/>
+              <w:bottom w:val="single" w:sz="4" w:space="0" w:color="auto"/>
+              <w:right w:val="single" w:sz="4" w:space="0" w:color="auto"/>
+            </w:tcBorders>
+            <w:vAlign w:val="center"/>
+            <w:hideMark/>
           </w:tcPr>
           <w:p>
             <w:pPr>
@@ -71,8 +187,35 @@
         </w:tc>
         <w:tc>
           <w:tcPr>
-            <w:tcW w:w="2410" w:type="dxa"/>
+            <w:tcW w:w="1064" w:type="pct"/>
+            <w:tcBorders>
+              <w:top w:val="single" w:sz="4" w:space="0" w:color="auto"/>
+              <w:left w:val="single" w:sz="4" w:space="0" w:color="auto"/>
+              <w:bottom w:val="single" w:sz="4" w:space="0" w:color="auto"/>
+              <w:right w:val="single" w:sz="4" w:space="0" w:color="auto"/>
+            </w:tcBorders>
+            <w:hideMark/>
+          </w:tcPr>
+          <w:p>
+            <w:pPr>
+              <w:pStyle w:val="Plattetekst"/>
+            </w:pPr>
+            <w:r>
+              <w:t>1-01-2022</w:t>
+            </w:r>
+          </w:p>
+        </w:tc>
+        <w:tc>
+          <w:tcPr>
+            <w:tcW w:w="1010" w:type="pct"/>
+            <w:tcBorders>
+              <w:top w:val="single" w:sz="4" w:space="0" w:color="auto"/>
+              <w:left w:val="single" w:sz="4" w:space="0" w:color="auto"/>
+              <w:bottom w:val="single" w:sz="4" w:space="0" w:color="auto"/>
+              <w:right w:val="single" w:sz="4" w:space="0" w:color="auto"/>
+            </w:tcBorders>
             <w:vAlign w:val="center"/>
+            <w:hideMark/>
           </w:tcPr>
           <w:p>
             <w:pPr>
@@ -85,8 +228,15 @@
         </w:tc>
         <w:tc>
           <w:tcPr>
-            <w:tcW w:w="5947" w:type="dxa"/>
+            <w:tcW w:w="2459" w:type="pct"/>
+            <w:tcBorders>
+              <w:top w:val="single" w:sz="4" w:space="0" w:color="auto"/>
+              <w:left w:val="single" w:sz="4" w:space="0" w:color="auto"/>
+              <w:bottom w:val="single" w:sz="4" w:space="0" w:color="auto"/>
+              <w:right w:val="single" w:sz="4" w:space="0" w:color="auto"/>
+            </w:tcBorders>
             <w:vAlign w:val="center"/>
+            <w:hideMark/>
           </w:tcPr>
           <w:p>
             <w:pPr>
@@ -101,31 +251,102 @@
       <w:tr>
         <w:tc>
           <w:tcPr>
-            <w:tcW w:w="1271" w:type="dxa"/>
+            <w:tcW w:w="468" w:type="pct"/>
+            <w:tcBorders>
+              <w:top w:val="single" w:sz="4" w:space="0" w:color="auto"/>
+              <w:left w:val="single" w:sz="4" w:space="0" w:color="auto"/>
+              <w:bottom w:val="single" w:sz="4" w:space="0" w:color="auto"/>
+              <w:right w:val="single" w:sz="4" w:space="0" w:color="auto"/>
+            </w:tcBorders>
             <w:vAlign w:val="center"/>
+            <w:hideMark/>
           </w:tcPr>
           <w:p>
             <w:pPr>
               <w:pStyle w:val="Plattetekst"/>
             </w:pPr>
+            <w:r>
+              <w:t>1.0.1</w:t>
+            </w:r>
           </w:p>
         </w:tc>
         <w:tc>
           <w:tcPr>
-            <w:tcW w:w="2410" w:type="dxa"/>
-            <w:vAlign w:val="center"/>
+            <w:tcW w:w="1064" w:type="pct"/>
+            <w:tcBorders>
+              <w:top w:val="single" w:sz="4" w:space="0" w:color="auto"/>
+              <w:left w:val="single" w:sz="4" w:space="0" w:color="auto"/>
+              <w:bottom w:val="single" w:sz="4" w:space="0" w:color="auto"/>
+              <w:right w:val="single" w:sz="4" w:space="0" w:color="auto"/>
+            </w:tcBorders>
+            <w:hideMark/>
           </w:tcPr>
           <w:p>
             <w:pPr>
               <w:pStyle w:val="Plattetekst"/>
             </w:pPr>
+            <w:r>
+              <w:t>5-10-2026</w:t>
+            </w:r>
           </w:p>
         </w:tc>
         <w:tc>
           <w:tcPr>
-            <w:tcW w:w="5947" w:type="dxa"/>
+            <w:tcW w:w="1010" w:type="pct"/>
+            <w:tcBorders>
+              <w:top w:val="single" w:sz="4" w:space="0" w:color="auto"/>
+              <w:left w:val="single" w:sz="4" w:space="0" w:color="auto"/>
+              <w:bottom w:val="single" w:sz="4" w:space="0" w:color="auto"/>
+              <w:right w:val="single" w:sz="4" w:space="0" w:color="auto"/>
+            </w:tcBorders>
             <w:vAlign w:val="center"/>
+            <w:hideMark/>
           </w:tcPr>
+          <w:p>
+            <w:pPr>
+              <w:pStyle w:val="Plattetekst"/>
+            </w:pPr>
+            <w:r>
+              <w:t>Robert Nieuwkoop</w:t>
+            </w:r>
+          </w:p>
+        </w:tc>
+        <w:tc>
+          <w:tcPr>
+            <w:tcW w:w="2459" w:type="pct"/>
+            <w:tcBorders>
+              <w:top w:val="single" w:sz="4" w:space="0" w:color="auto"/>
+              <w:left w:val="single" w:sz="4" w:space="0" w:color="auto"/>
+              <w:bottom w:val="single" w:sz="4" w:space="0" w:color="auto"/>
+              <w:right w:val="single" w:sz="4" w:space="0" w:color="auto"/>
+            </w:tcBorders>
+            <w:vAlign w:val="center"/>
+            <w:hideMark/>
+          </w:tcPr>
+          <w:p>
+            <w:pPr>
+              <w:pStyle w:val="Plattetekst"/>
+            </w:pPr>
+            <w:r>
+              <w:t>De codebase en dit document zijn voortaan te vinden in een GIT repository. Link is toegevoegd</w:t>
+            </w:r>
+          </w:p>
+          <w:p>
+            <w:pPr>
+              <w:pStyle w:val="Plattetekst"/>
+            </w:pPr>
+            <w:r>
+              <w:t>Opdracht 1 ingekort (Het is niet meer nodig om een .zip te downloaden en uit te pakken)</w:t>
+            </w:r>
+          </w:p>
+          <w:p>
+            <w:pPr>
+              <w:pStyle w:val="Plattetekst"/>
+            </w:pPr>
+            <w:r>
+              <w:t>(Optionele) Opdracht 4 toegevoegd aan dit document. Deze opdracht gaat dieper in op de basis principes van OOP (Inheritance) en maakt een sprongetje naar de Template Method Pattern.</w:t>
+            </w:r>
+          </w:p>
           <w:p>
             <w:pPr>
               <w:pStyle w:val="Plattetekst"/>
@@ -171,9 +392,7 @@
             <w:rPr>
               <w:noProof/>
               <w:kern w:val="2"/>
-              <w:sz w:val="22"/>
-              <w:szCs w:val="22"/>
-              <w:lang/>
+              <w:lang w:eastAsia="nl-NL"/>
               <w14:ligatures w14:val="standardContextual"/>
             </w:rPr>
           </w:pPr>
@@ -186,7 +405,7 @@
           <w:r>
             <w:fldChar w:fldCharType="separate"/>
           </w:r>
-          <w:hyperlink w:anchor="_Toc143607195" w:history="1">
+          <w:hyperlink w:anchor="_Toc242097583" w:history="1">
             <w:r>
               <w:rPr>
                 <w:rStyle w:val="Hyperlink"/>
@@ -213,7 +432,78 @@
                 <w:noProof/>
                 <w:webHidden/>
               </w:rPr>
-              <w:instrText xml:space="preserve"> PAGEREF _Toc143607195 \h </w:instrText>
+              <w:instrText xml:space="preserve"> PAGEREF _Toc242097583 \h </w:instrText>
+            </w:r>
+            <w:r>
+              <w:rPr>
+                <w:noProof/>
+                <w:webHidden/>
+              </w:rPr>
+            </w:r>
+            <w:r>
+              <w:rPr>
+                <w:noProof/>
+                <w:webHidden/>
+              </w:rPr>
+              <w:fldChar w:fldCharType="separate"/>
+            </w:r>
+            <w:r>
+              <w:rPr>
+                <w:noProof/>
+                <w:webHidden/>
+              </w:rPr>
+              <w:t>2</w:t>
+            </w:r>
+            <w:r>
+              <w:rPr>
+                <w:noProof/>
+                <w:webHidden/>
+              </w:rPr>
+              <w:fldChar w:fldCharType="end"/>
+            </w:r>
+          </w:hyperlink>
+        </w:p>
+        <w:p>
+          <w:pPr>
+            <w:pStyle w:val="Inhopg1"/>
+            <w:tabs>
+              <w:tab w:val="right" w:leader="dot" w:pos="9628"/>
+            </w:tabs>
+            <w:rPr>
+              <w:noProof/>
+              <w:kern w:val="2"/>
+              <w:lang w:eastAsia="nl-NL"/>
+              <w14:ligatures w14:val="standardContextual"/>
+            </w:rPr>
+          </w:pPr>
+          <w:hyperlink w:anchor="_Toc242097584" w:history="1">
+            <w:r>
+              <w:rPr>
+                <w:rStyle w:val="Hyperlink"/>
+                <w:noProof/>
+              </w:rPr>
+              <w:t>Opdracht #2 – Implementing interfaces</w:t>
+            </w:r>
+            <w:r>
+              <w:rPr>
+                <w:noProof/>
+                <w:webHidden/>
+              </w:rPr>
+              <w:tab/>
+            </w:r>
+            <w:r>
+              <w:rPr>
+                <w:noProof/>
+                <w:webHidden/>
+              </w:rPr>
+              <w:fldChar w:fldCharType="begin"/>
+            </w:r>
+            <w:r>
+              <w:rPr>
+                <w:noProof/>
+                <w:webHidden/>
+              </w:rPr>
+              <w:instrText xml:space="preserve"> PAGEREF _Toc242097584 \h </w:instrText>
             </w:r>
             <w:r>
               <w:rPr>
@@ -253,19 +543,17 @@
             <w:rPr>
               <w:noProof/>
               <w:kern w:val="2"/>
-              <w:sz w:val="22"/>
-              <w:szCs w:val="22"/>
-              <w:lang/>
+              <w:lang w:eastAsia="nl-NL"/>
               <w14:ligatures w14:val="standardContextual"/>
             </w:rPr>
           </w:pPr>
-          <w:hyperlink w:anchor="_Toc143607196" w:history="1">
+          <w:hyperlink w:anchor="_Toc242097585" w:history="1">
             <w:r>
               <w:rPr>
                 <w:rStyle w:val="Hyperlink"/>
                 <w:noProof/>
               </w:rPr>
-              <w:t>Opdracht #2 – Implementing interfaces</w:t>
+              <w:t>Opdracht #3 – Testing</w:t>
             </w:r>
             <w:r>
               <w:rPr>
@@ -286,7 +574,7 @@
                 <w:noProof/>
                 <w:webHidden/>
               </w:rPr>
-              <w:instrText xml:space="preserve"> PAGEREF _Toc143607196 \h </w:instrText>
+              <w:instrText xml:space="preserve"> PAGEREF _Toc242097585 \h </w:instrText>
             </w:r>
             <w:r>
               <w:rPr>
@@ -306,7 +594,78 @@
                 <w:noProof/>
                 <w:webHidden/>
               </w:rPr>
-              <w:t>4</w:t>
+              <w:t>3</w:t>
+            </w:r>
+            <w:r>
+              <w:rPr>
+                <w:noProof/>
+                <w:webHidden/>
+              </w:rPr>
+              <w:fldChar w:fldCharType="end"/>
+            </w:r>
+          </w:hyperlink>
+        </w:p>
+        <w:p>
+          <w:pPr>
+            <w:pStyle w:val="Inhopg1"/>
+            <w:tabs>
+              <w:tab w:val="right" w:leader="dot" w:pos="9628"/>
+            </w:tabs>
+            <w:rPr>
+              <w:noProof/>
+              <w:kern w:val="2"/>
+              <w:lang w:eastAsia="nl-NL"/>
+              <w14:ligatures w14:val="standardContextual"/>
+            </w:rPr>
+          </w:pPr>
+          <w:hyperlink w:anchor="_Toc242097586" w:history="1">
+            <w:r>
+              <w:rPr>
+                <w:rStyle w:val="Hyperlink"/>
+                <w:noProof/>
+              </w:rPr>
+              <w:t>Opdracht #4 – Implementing OOP principles</w:t>
+            </w:r>
+            <w:r>
+              <w:rPr>
+                <w:noProof/>
+                <w:webHidden/>
+              </w:rPr>
+              <w:tab/>
+            </w:r>
+            <w:r>
+              <w:rPr>
+                <w:noProof/>
+                <w:webHidden/>
+              </w:rPr>
+              <w:fldChar w:fldCharType="begin"/>
+            </w:r>
+            <w:r>
+              <w:rPr>
+                <w:noProof/>
+                <w:webHidden/>
+              </w:rPr>
+              <w:instrText xml:space="preserve"> PAGEREF _Toc242097586 \h </w:instrText>
+            </w:r>
+            <w:r>
+              <w:rPr>
+                <w:noProof/>
+                <w:webHidden/>
+              </w:rPr>
+            </w:r>
+            <w:r>
+              <w:rPr>
+                <w:noProof/>
+                <w:webHidden/>
+              </w:rPr>
+              <w:fldChar w:fldCharType="separate"/>
+            </w:r>
+            <w:r>
+              <w:rPr>
+                <w:noProof/>
+                <w:webHidden/>
+              </w:rPr>
+              <w:t>3</w:t>
             </w:r>
             <w:r>
               <w:rPr>
@@ -331,7 +690,7 @@
       <w:r>
         <w:br w:type="page"/>
       </w:r>
-      <w:bookmarkStart w:id="0" w:name="_Toc143607195"/>
+      <w:bookmarkStart w:id="0" w:name="_Toc242097583"/>
       <w:r>
         <w:lastRenderedPageBreak/>
         <w:t>Opdracht #1</w:t>
@@ -343,58 +702,6 @@
     </w:p>
     <w:p>
       <w:pPr>
-        <w:pStyle w:val="Geenafstand"/>
-        <w:numPr>
-          <w:ilvl w:val="0"/>
-          <w:numId w:val="16"/>
-        </w:numPr>
-      </w:pPr>
-      <w:r>
-        <w:t>Download het mapje “</w:t>
-      </w:r>
-      <w:proofErr w:type="spellStart"/>
-      <w:r>
-        <w:t>Observer</w:t>
-      </w:r>
-      <w:proofErr w:type="spellEnd"/>
-      <w:r>
-        <w:t xml:space="preserve"> Pattern</w:t>
-      </w:r>
-      <w:r>
-        <w:t>.zip</w:t>
-      </w:r>
-      <w:r>
-        <w:t>” van Teams</w:t>
-      </w:r>
-      <w:r>
-        <w:t xml:space="preserve"> en pak uit</w:t>
-      </w:r>
-    </w:p>
-    <w:p>
-      <w:pPr>
-        <w:pStyle w:val="Geenafstand"/>
-        <w:numPr>
-          <w:ilvl w:val="0"/>
-          <w:numId w:val="16"/>
-        </w:numPr>
-      </w:pPr>
-      <w:r>
-        <w:t>Open het .</w:t>
-      </w:r>
-      <w:proofErr w:type="spellStart"/>
-      <w:r>
-        <w:t>csproj</w:t>
-      </w:r>
-      <w:proofErr w:type="spellEnd"/>
-      <w:r>
-        <w:t xml:space="preserve"> bestand met Visual Studio (niet Visual Studio Code)</w:t>
-      </w:r>
-      <w:r>
-        <w:tab/>
-      </w:r>
-    </w:p>
-    <w:p>
-      <w:pPr>
         <w:spacing w:after="0"/>
       </w:pPr>
     </w:p>
@@ -408,10 +715,10 @@
           <w:noProof/>
         </w:rPr>
         <w:drawing>
-          <wp:inline distT="0" distB="0" distL="0" distR="0" wp14:anchorId="52548B09" wp14:editId="6F9D2695">
-            <wp:extent cx="4489145" cy="5402945"/>
-            <wp:effectExtent l="0" t="0" r="6985" b="7620"/>
-            <wp:docPr id="7" name="Tijdelijke aanduiding voor inhoud 6" descr="Afbeelding met tekst, schermopname, Lettertype, document&#10;&#10;Automatisch gegenereerde beschrijving">
+          <wp:inline distT="0" distB="0" distL="0" distR="0" wp14:anchorId="52548B09" wp14:editId="57ADA695">
+            <wp:extent cx="4489145" cy="5390374"/>
+            <wp:effectExtent l="0" t="0" r="6985" b="1270"/>
+            <wp:docPr id="7" name="Tijdelijke aanduiding voor inhoud 6">
               <a:extLst xmlns:a="http://schemas.openxmlformats.org/drawingml/2006/main">
                 <a:ext uri="{FF2B5EF4-FFF2-40B4-BE49-F238E27FC236}">
                   <a16:creationId xmlns:a16="http://schemas.microsoft.com/office/drawing/2014/main" id="{86E24C70-0C0D-A13D-D265-85669E0A0656}"/>
@@ -425,7 +732,7 @@
               <a:graphicData uri="http://schemas.openxmlformats.org/drawingml/2006/picture">
                 <pic:pic xmlns:pic="http://schemas.openxmlformats.org/drawingml/2006/picture">
                   <pic:nvPicPr>
-                    <pic:cNvPr id="7" name="Tijdelijke aanduiding voor inhoud 6" descr="Afbeelding met tekst, schermopname, Lettertype, document&#10;&#10;Automatisch gegenereerde beschrijving">
+                    <pic:cNvPr id="7" name="Tijdelijke aanduiding voor inhoud 6">
                       <a:extLst>
                         <a:ext uri="{FF2B5EF4-FFF2-40B4-BE49-F238E27FC236}">
                           <a16:creationId xmlns:a16="http://schemas.microsoft.com/office/drawing/2014/main" id="{86E24C70-0C0D-A13D-D265-85669E0A0656}"/>
@@ -437,19 +744,15 @@
                     </pic:cNvPicPr>
                   </pic:nvPicPr>
                   <pic:blipFill>
-                    <a:blip r:embed="rId12">
-                      <a:extLst>
-                        <a:ext uri="{28A0092B-C50C-407E-A947-70E740481C1C}">
-                          <a14:useLocalDpi xmlns:a14="http://schemas.microsoft.com/office/drawing/2010/main" val="0"/>
-                        </a:ext>
-                      </a:extLst>
-                    </a:blip>
-                    <a:stretch/>
+                    <a:blip r:embed="rId12"/>
+                    <a:stretch>
+                      <a:fillRect/>
+                    </a:stretch>
                   </pic:blipFill>
                   <pic:spPr>
                     <a:xfrm>
                       <a:off x="0" y="0"/>
-                      <a:ext cx="4489145" cy="5402945"/>
+                      <a:ext cx="4489145" cy="5390374"/>
                     </a:xfrm>
                     <a:prstGeom prst="rect">
                       <a:avLst/>
@@ -476,7 +779,6 @@
           <w:szCs w:val="32"/>
         </w:rPr>
       </w:pPr>
-      <w:bookmarkStart w:id="1" w:name="_Toc143607196"/>
       <w:r>
         <w:br w:type="page"/>
       </w:r>
@@ -485,28 +787,29 @@
       <w:pPr>
         <w:pStyle w:val="Kop1"/>
       </w:pPr>
+      <w:bookmarkStart w:id="1" w:name="_Toc242097584"/>
       <w:r>
         <w:lastRenderedPageBreak/>
         <w:t>Opdracht #2</w:t>
       </w:r>
       <w:r>
-        <w:t xml:space="preserve"> – </w:t>
-      </w:r>
-      <w:proofErr w:type="spellStart"/>
-      <w:r>
-        <w:t>Implementing</w:t>
-      </w:r>
-      <w:proofErr w:type="spellEnd"/>
-      <w:r>
-        <w:t xml:space="preserve"> interfaces</w:t>
+        <w:t xml:space="preserve"> – Implementing interfaces</w:t>
       </w:r>
       <w:bookmarkEnd w:id="1"/>
     </w:p>
     <w:p>
       <w:pPr>
         <w:pStyle w:val="Geenafstand"/>
+        <w:rPr>
+          <w:sz w:val="28"/>
+          <w:szCs w:val="28"/>
+        </w:rPr>
       </w:pPr>
       <w:r>
+        <w:rPr>
+          <w:sz w:val="28"/>
+          <w:szCs w:val="28"/>
+        </w:rPr>
         <w:t>Bekijk het commentaar in de code. De code moet aan het volgende voldoen:</w:t>
       </w:r>
     </w:p>
@@ -517,28 +820,35 @@
           <w:ilvl w:val="0"/>
           <w:numId w:val="21"/>
         </w:numPr>
+        <w:rPr>
+          <w:sz w:val="28"/>
+          <w:szCs w:val="28"/>
+        </w:rPr>
       </w:pPr>
       <w:r>
+        <w:rPr>
+          <w:sz w:val="28"/>
+          <w:szCs w:val="28"/>
+        </w:rPr>
         <w:t xml:space="preserve">De </w:t>
       </w:r>
-      <w:proofErr w:type="spellStart"/>
       <w:r>
+        <w:rPr>
+          <w:b/>
+          <w:bCs/>
+          <w:i/>
+          <w:iCs/>
+          <w:sz w:val="28"/>
+          <w:szCs w:val="28"/>
+        </w:rPr>
         <w:t>CurrentConditionDisplay</w:t>
       </w:r>
-      <w:proofErr w:type="spellEnd"/>
       <w:r>
-        <w:t xml:space="preserve"> moet de huidige staat van het weer printen wanneer </w:t>
-      </w:r>
-      <w:proofErr w:type="spellStart"/>
-      <w:r>
-        <w:t>WeatherData</w:t>
-      </w:r>
-      <w:proofErr w:type="spellEnd"/>
-      <w:r>
-        <w:t xml:space="preserve"> een </w:t>
-      </w:r>
-      <w:r>
-        <w:t>Update() verstuurd</w:t>
+        <w:rPr>
+          <w:sz w:val="28"/>
+          <w:szCs w:val="28"/>
+        </w:rPr>
+        <w:t xml:space="preserve"> moet de huidige staat van het weer printen</w:t>
       </w:r>
     </w:p>
     <w:p>
@@ -548,25 +858,35 @@
           <w:ilvl w:val="0"/>
           <w:numId w:val="21"/>
         </w:numPr>
+        <w:rPr>
+          <w:sz w:val="28"/>
+          <w:szCs w:val="28"/>
+        </w:rPr>
       </w:pPr>
       <w:r>
+        <w:rPr>
+          <w:sz w:val="28"/>
+          <w:szCs w:val="28"/>
+        </w:rPr>
         <w:t xml:space="preserve">De </w:t>
       </w:r>
-      <w:proofErr w:type="spellStart"/>
       <w:r>
+        <w:rPr>
+          <w:b/>
+          <w:bCs/>
+          <w:i/>
+          <w:iCs/>
+          <w:sz w:val="28"/>
+          <w:szCs w:val="28"/>
+        </w:rPr>
         <w:t>ForecastDisplay</w:t>
       </w:r>
-      <w:proofErr w:type="spellEnd"/>
       <w:r>
-        <w:t xml:space="preserve"> moet een voorspelling geven van het weer gebaseerd op informatie van de </w:t>
-      </w:r>
-      <w:proofErr w:type="spellStart"/>
-      <w:r>
-        <w:t>WeatherData</w:t>
-      </w:r>
-      <w:proofErr w:type="spellEnd"/>
-      <w:r>
-        <w:t>. Dit moet in de vorm van een bericht zoals “Mooi weer komt er aan” of “Trek je paraplu’s uit de kast”</w:t>
+        <w:rPr>
+          <w:sz w:val="28"/>
+          <w:szCs w:val="28"/>
+        </w:rPr>
+        <w:t xml:space="preserve"> moet een voorspelling geven van het weer gebaseerd op informatie van de WeatherData. Dit moet in de vorm van een bericht zoals “Mooi weer komt er aan” of “Trek je paraplu’s uit de kast”</w:t>
       </w:r>
     </w:p>
     <w:p>
@@ -576,16 +896,34 @@
           <w:ilvl w:val="0"/>
           <w:numId w:val="21"/>
         </w:numPr>
+        <w:rPr>
+          <w:sz w:val="28"/>
+          <w:szCs w:val="28"/>
+        </w:rPr>
       </w:pPr>
       <w:r>
+        <w:rPr>
+          <w:sz w:val="28"/>
+          <w:szCs w:val="28"/>
+        </w:rPr>
         <w:t xml:space="preserve">De </w:t>
       </w:r>
-      <w:proofErr w:type="spellStart"/>
       <w:r>
+        <w:rPr>
+          <w:b/>
+          <w:bCs/>
+          <w:i/>
+          <w:iCs/>
+          <w:sz w:val="28"/>
+          <w:szCs w:val="28"/>
+        </w:rPr>
         <w:t>StatisticsDisplay</w:t>
       </w:r>
-      <w:proofErr w:type="spellEnd"/>
       <w:r>
+        <w:rPr>
+          <w:sz w:val="28"/>
+          <w:szCs w:val="28"/>
+        </w:rPr>
         <w:t xml:space="preserve"> moet het gemiddelde, maximale en minimale van de temperatuur laten zien. Maak hiervoor gebruik van de fields die in de class zijn gegeven.</w:t>
       </w:r>
     </w:p>
@@ -596,214 +934,484 @@
           <w:ilvl w:val="0"/>
           <w:numId w:val="21"/>
         </w:numPr>
+        <w:rPr>
+          <w:sz w:val="28"/>
+          <w:szCs w:val="28"/>
+        </w:rPr>
       </w:pPr>
       <w:r>
         <w:rPr>
+          <w:sz w:val="28"/>
+          <w:szCs w:val="28"/>
           <w:lang w:val="en-GB"/>
         </w:rPr>
         <w:t xml:space="preserve">De </w:t>
       </w:r>
-      <w:proofErr w:type="spellStart"/>
       <w:r>
         <w:rPr>
+          <w:b/>
+          <w:bCs/>
+          <w:i/>
+          <w:iCs/>
+          <w:sz w:val="28"/>
+          <w:szCs w:val="28"/>
           <w:lang w:val="en-GB"/>
         </w:rPr>
         <w:t>WeatherData</w:t>
       </w:r>
-      <w:proofErr w:type="spellEnd"/>
       <w:r>
         <w:rPr>
+          <w:sz w:val="28"/>
+          <w:szCs w:val="28"/>
           <w:lang w:val="en-GB"/>
         </w:rPr>
-        <w:t xml:space="preserve"> class is </w:t>
-      </w:r>
-      <w:proofErr w:type="spellStart"/>
-      <w:r>
-        <w:rPr>
-          <w:lang w:val="en-GB"/>
-        </w:rPr>
-        <w:t>n</w:t>
+        <w:t xml:space="preserve"> class is nog incompleet. </w:t>
       </w:r>
       <w:r>
         <w:rPr>
-          <w:lang w:val="en-GB"/>
+          <w:sz w:val="28"/>
+          <w:szCs w:val="28"/>
         </w:rPr>
-        <w:t>og</w:t>
+        <w:t>Lees het commentaar rustig door en vul de code aan.</w:t>
       </w:r>
-      <w:proofErr w:type="spellEnd"/>
+    </w:p>
+    <w:p>
+      <w:pPr>
+        <w:pStyle w:val="Geenafstand"/>
+      </w:pPr>
+    </w:p>
+    <w:p>
+      <w:pPr>
+        <w:pStyle w:val="Kop1"/>
+      </w:pPr>
+      <w:bookmarkStart w:id="2" w:name="_Toc242097585"/>
+      <w:r>
+        <w:t>Opdracht #3 – Testing</w:t>
+      </w:r>
+      <w:bookmarkEnd w:id="2"/>
+    </w:p>
+    <w:p>
+      <w:pPr>
+        <w:pStyle w:val="Geenafstand"/>
+        <w:rPr>
+          <w:sz w:val="28"/>
+          <w:szCs w:val="28"/>
+        </w:rPr>
+      </w:pPr>
       <w:r>
         <w:rPr>
-          <w:lang w:val="en-GB"/>
+          <w:sz w:val="28"/>
+          <w:szCs w:val="28"/>
         </w:rPr>
-        <w:t xml:space="preserve"> </w:t>
+        <w:t xml:space="preserve">Test de code door in de main een instantie te maken van </w:t>
       </w:r>
-      <w:proofErr w:type="spellStart"/>
       <w:r>
         <w:rPr>
-          <w:lang w:val="en-GB"/>
+          <w:sz w:val="28"/>
+          <w:szCs w:val="28"/>
+          <w:u w:val="single"/>
         </w:rPr>
-        <w:t>incompleet</w:t>
+        <w:t>iedere</w:t>
       </w:r>
-      <w:proofErr w:type="spellEnd"/>
       <w:r>
         <w:rPr>
-          <w:lang w:val="en-GB"/>
+          <w:sz w:val="28"/>
+          <w:szCs w:val="28"/>
+        </w:rPr>
+        <w:t xml:space="preserve"> display. Vergeet niet om de </w:t>
+      </w:r>
+      <w:r>
+        <w:rPr>
+          <w:b/>
+          <w:bCs/>
+          <w:sz w:val="28"/>
+          <w:szCs w:val="28"/>
+        </w:rPr>
+        <w:t>WeatherData</w:t>
+      </w:r>
+      <w:r>
+        <w:rPr>
+          <w:sz w:val="28"/>
+          <w:szCs w:val="28"/>
+        </w:rPr>
+        <w:t xml:space="preserve"> mee te geven als argument aan de constructor.</w:t>
+      </w:r>
+    </w:p>
+    <w:p>
+      <w:pPr>
+        <w:pStyle w:val="Geenafstand"/>
+        <w:rPr>
+          <w:sz w:val="28"/>
+          <w:szCs w:val="28"/>
+        </w:rPr>
+      </w:pPr>
+    </w:p>
+    <w:p>
+      <w:pPr>
+        <w:pStyle w:val="Geenafstand"/>
+        <w:rPr>
+          <w:sz w:val="28"/>
+          <w:szCs w:val="28"/>
+        </w:rPr>
+      </w:pPr>
+      <w:r>
+        <w:rPr>
+          <w:sz w:val="28"/>
+          <w:szCs w:val="28"/>
+        </w:rPr>
+        <w:t>Door alleen “</w:t>
+      </w:r>
+      <w:r>
+        <w:rPr>
+          <w:b/>
+          <w:bCs/>
+          <w:i/>
+          <w:iCs/>
+          <w:sz w:val="28"/>
+          <w:szCs w:val="28"/>
+        </w:rPr>
+        <w:t>SetMeasurements</w:t>
+      </w:r>
+      <w:r>
+        <w:rPr>
+          <w:sz w:val="28"/>
+          <w:szCs w:val="28"/>
+        </w:rPr>
+        <w:t>()</w:t>
+      </w:r>
+      <w:r>
+        <w:rPr>
+          <w:sz w:val="28"/>
+          <w:szCs w:val="28"/>
+        </w:rPr>
+        <w:t>”</w:t>
+      </w:r>
+      <w:r>
+        <w:rPr>
+          <w:sz w:val="28"/>
+          <w:szCs w:val="28"/>
+        </w:rPr>
+        <w:t xml:space="preserve"> aan te roepen in de main verander je de state van WeatherData. Dit zorgt er weer voor dat WeatherData alle Observers update over de veranderingen.</w:t>
+      </w:r>
+    </w:p>
+    <w:p>
+      <w:pPr>
+        <w:pStyle w:val="Geenafstand"/>
+        <w:rPr>
+          <w:sz w:val="28"/>
+          <w:szCs w:val="28"/>
+        </w:rPr>
+      </w:pPr>
+    </w:p>
+    <w:p>
+      <w:pPr>
+        <w:rPr>
+          <w:rFonts w:asciiTheme="majorHAnsi" w:eastAsiaTheme="majorEastAsia" w:hAnsiTheme="majorHAnsi" w:cstheme="majorBidi"/>
+          <w:color w:val="3D1639" w:themeColor="accent1" w:themeShade="BF"/>
+          <w:sz w:val="32"/>
+          <w:szCs w:val="32"/>
+        </w:rPr>
+      </w:pPr>
+      <w:bookmarkStart w:id="3" w:name="_Toc242097586"/>
+      <w:r>
+        <w:br w:type="page"/>
+      </w:r>
+    </w:p>
+    <w:p>
+      <w:pPr>
+        <w:pStyle w:val="Kop1"/>
+      </w:pPr>
+      <w:r>
+        <w:lastRenderedPageBreak/>
+        <w:t>Opdracht #4 – Implementing OOP principles</w:t>
+      </w:r>
+      <w:bookmarkEnd w:id="3"/>
+    </w:p>
+    <w:p>
+      <w:pPr>
+        <w:rPr>
+          <w:sz w:val="28"/>
+          <w:szCs w:val="28"/>
+        </w:rPr>
+      </w:pPr>
+      <w:r>
+        <w:rPr>
+          <w:sz w:val="28"/>
+          <w:szCs w:val="28"/>
+        </w:rPr>
+        <w:t>Zie onderstaand klassendiagram.</w:t>
+      </w:r>
+    </w:p>
+    <w:p>
+      <w:pPr>
+        <w:pStyle w:val="Geenafstand"/>
+      </w:pPr>
+      <w:r>
+        <w:rPr>
+          <w:noProof/>
+        </w:rPr>
+        <w:drawing>
+          <wp:inline distT="0" distB="0" distL="0" distR="0" wp14:anchorId="79274DFE" wp14:editId="671A1344">
+            <wp:extent cx="5873750" cy="5478780"/>
+            <wp:effectExtent l="0" t="0" r="0" b="7620"/>
+            <wp:docPr id="840348227" name="Afbeelding 24"/>
+            <wp:cNvGraphicFramePr>
+              <a:graphicFrameLocks xmlns:a="http://schemas.openxmlformats.org/drawingml/2006/main" noChangeAspect="1"/>
+            </wp:cNvGraphicFramePr>
+            <a:graphic xmlns:a="http://schemas.openxmlformats.org/drawingml/2006/main">
+              <a:graphicData uri="http://schemas.openxmlformats.org/drawingml/2006/picture">
+                <pic:pic xmlns:pic="http://schemas.openxmlformats.org/drawingml/2006/picture">
+                  <pic:nvPicPr>
+                    <pic:cNvPr id="0" name="Picture 13"/>
+                    <pic:cNvPicPr>
+                      <a:picLocks noChangeAspect="1" noChangeArrowheads="1"/>
+                    </pic:cNvPicPr>
+                  </pic:nvPicPr>
+                  <pic:blipFill>
+                    <a:blip r:embed="rId13">
+                      <a:extLst>
+                        <a:ext uri="{28A0092B-C50C-407E-A947-70E740481C1C}">
+                          <a14:useLocalDpi xmlns:a14="http://schemas.microsoft.com/office/drawing/2010/main" val="0"/>
+                        </a:ext>
+                      </a:extLst>
+                    </a:blip>
+                    <a:srcRect/>
+                    <a:stretch>
+                      <a:fillRect/>
+                    </a:stretch>
+                  </pic:blipFill>
+                  <pic:spPr bwMode="auto">
+                    <a:xfrm>
+                      <a:off x="0" y="0"/>
+                      <a:ext cx="5873750" cy="5478780"/>
+                    </a:xfrm>
+                    <a:prstGeom prst="rect">
+                      <a:avLst/>
+                    </a:prstGeom>
+                    <a:noFill/>
+                    <a:ln>
+                      <a:noFill/>
+                    </a:ln>
+                  </pic:spPr>
+                </pic:pic>
+              </a:graphicData>
+            </a:graphic>
+          </wp:inline>
+        </w:drawing>
+      </w:r>
+    </w:p>
+    <w:p>
+      <w:pPr>
+        <w:pStyle w:val="Geenafstand"/>
+        <w:rPr>
+          <w:sz w:val="28"/>
+          <w:szCs w:val="28"/>
+        </w:rPr>
+      </w:pPr>
+    </w:p>
+    <w:p>
+      <w:pPr>
+        <w:pStyle w:val="Geenafstand"/>
+        <w:numPr>
+          <w:ilvl w:val="0"/>
+          <w:numId w:val="23"/>
+        </w:numPr>
+        <w:rPr>
+          <w:sz w:val="28"/>
+          <w:szCs w:val="28"/>
+        </w:rPr>
+      </w:pPr>
+      <w:r>
+        <w:rPr>
+          <w:sz w:val="28"/>
+          <w:szCs w:val="28"/>
+        </w:rPr>
+        <w:t>Maak de</w:t>
+      </w:r>
+      <w:r>
+        <w:rPr>
+          <w:sz w:val="28"/>
+          <w:szCs w:val="28"/>
+        </w:rPr>
+        <w:t xml:space="preserve"> abstracte</w:t>
+      </w:r>
+      <w:r>
+        <w:rPr>
+          <w:sz w:val="28"/>
+          <w:szCs w:val="28"/>
+        </w:rPr>
+        <w:t xml:space="preserve"> parent class</w:t>
+      </w:r>
+      <w:r>
+        <w:rPr>
+          <w:b/>
+          <w:bCs/>
+          <w:i/>
+          <w:iCs/>
+          <w:sz w:val="28"/>
+          <w:szCs w:val="28"/>
+        </w:rPr>
+        <w:t>WeatherDisplay</w:t>
+      </w:r>
+      <w:r>
+        <w:rPr>
+          <w:sz w:val="28"/>
+          <w:szCs w:val="28"/>
         </w:rPr>
         <w:t xml:space="preserve">. </w:t>
       </w:r>
+    </w:p>
+    <w:p>
+      <w:pPr>
+        <w:pStyle w:val="Geenafstand"/>
+        <w:numPr>
+          <w:ilvl w:val="0"/>
+          <w:numId w:val="23"/>
+        </w:numPr>
+        <w:rPr>
+          <w:sz w:val="28"/>
+          <w:szCs w:val="28"/>
+        </w:rPr>
+      </w:pPr>
       <w:r>
-        <w:t>Lees het commentaar rustig d</w:t>
+        <w:rPr>
+          <w:sz w:val="28"/>
+          <w:szCs w:val="28"/>
+        </w:rPr>
+        <w:t>Declareer en definieer</w:t>
       </w:r>
       <w:r>
-        <w:t>oor en vul de code aan.</w:t>
+        <w:rPr>
+          <w:sz w:val="28"/>
+          <w:szCs w:val="28"/>
+        </w:rPr>
+        <w:t xml:space="preserve"> de </w:t>
+      </w:r>
+      <w:r>
+        <w:rPr>
+          <w:b/>
+          <w:bCs/>
+          <w:i/>
+          <w:iCs/>
+          <w:sz w:val="28"/>
+          <w:szCs w:val="28"/>
+        </w:rPr>
+        <w:t>Update</w:t>
+      </w:r>
+      <w:r>
+        <w:rPr>
+          <w:sz w:val="28"/>
+          <w:szCs w:val="28"/>
+        </w:rPr>
+        <w:t>() methode</w:t>
+      </w:r>
+      <w:r>
+        <w:rPr>
+          <w:sz w:val="28"/>
+          <w:szCs w:val="28"/>
+        </w:rPr>
+        <w:t xml:space="preserve"> in deze class</w:t>
       </w:r>
     </w:p>
     <w:p>
       <w:pPr>
         <w:pStyle w:val="Geenafstand"/>
-      </w:pPr>
-    </w:p>
-    <w:p>
-      <w:pPr>
-        <w:pStyle w:val="Kop1"/>
+        <w:numPr>
+          <w:ilvl w:val="0"/>
+          <w:numId w:val="23"/>
+        </w:numPr>
+        <w:rPr>
+          <w:sz w:val="28"/>
+          <w:szCs w:val="28"/>
+        </w:rPr>
       </w:pPr>
       <w:r>
-        <w:t xml:space="preserve">Opdracht #3 – </w:t>
+        <w:rPr>
+          <w:sz w:val="28"/>
+          <w:szCs w:val="28"/>
+        </w:rPr>
+        <w:t xml:space="preserve">Declareer de abstracte </w:t>
       </w:r>
-      <w:proofErr w:type="spellStart"/>
       <w:r>
-        <w:t>Testing</w:t>
+        <w:rPr>
+          <w:b/>
+          <w:bCs/>
+          <w:i/>
+          <w:iCs/>
+          <w:sz w:val="28"/>
+          <w:szCs w:val="28"/>
+        </w:rPr>
+        <w:t>Display</w:t>
       </w:r>
-      <w:proofErr w:type="spellEnd"/>
-    </w:p>
-    <w:p>
-      <w:pPr>
-        <w:pStyle w:val="Geenafstand"/>
-      </w:pPr>
       <w:r>
-        <w:t xml:space="preserve">Test de code door in de </w:t>
-      </w:r>
-      <w:proofErr w:type="spellStart"/>
-      <w:r>
-        <w:t>main</w:t>
-      </w:r>
-      <w:proofErr w:type="spellEnd"/>
-      <w:r>
-        <w:t xml:space="preserve"> een instantie te maken van iedere display. Vergeet niet om de </w:t>
-      </w:r>
-      <w:proofErr w:type="spellStart"/>
-      <w:r>
-        <w:t>WeatherData</w:t>
-      </w:r>
-      <w:proofErr w:type="spellEnd"/>
-      <w:r>
-        <w:t xml:space="preserve"> mee te geven als argument aan de </w:t>
-      </w:r>
-      <w:proofErr w:type="spellStart"/>
-      <w:r>
-        <w:t>constructor</w:t>
-      </w:r>
-      <w:proofErr w:type="spellEnd"/>
-      <w:r>
-        <w:t>.</w:t>
+        <w:rPr>
+          <w:sz w:val="28"/>
+          <w:szCs w:val="28"/>
+        </w:rPr>
+        <w:t>() methode</w:t>
       </w:r>
     </w:p>
     <w:p>
       <w:pPr>
         <w:pStyle w:val="Geenafstand"/>
-      </w:pPr>
-    </w:p>
-    <w:p>
-      <w:pPr>
-        <w:pStyle w:val="Geenafstand"/>
+        <w:numPr>
+          <w:ilvl w:val="0"/>
+          <w:numId w:val="23"/>
+        </w:numPr>
+        <w:rPr>
+          <w:sz w:val="28"/>
+          <w:szCs w:val="28"/>
+        </w:rPr>
       </w:pPr>
       <w:r>
-        <w:t>Door alleen “</w:t>
-      </w:r>
-      <w:proofErr w:type="spellStart"/>
-      <w:r>
-        <w:t>SetMeasurements</w:t>
-      </w:r>
-      <w:proofErr w:type="spellEnd"/>
-      <w:r>
-        <w:t>()</w:t>
-      </w:r>
-      <w:r>
-        <w:t>”</w:t>
-      </w:r>
-      <w:r>
-        <w:t xml:space="preserve"> aan te roepen in de </w:t>
-      </w:r>
-      <w:proofErr w:type="spellStart"/>
-      <w:r>
-        <w:t>main</w:t>
-      </w:r>
-      <w:proofErr w:type="spellEnd"/>
-      <w:r>
-        <w:t xml:space="preserve"> verander je de state van </w:t>
-      </w:r>
-      <w:proofErr w:type="spellStart"/>
-      <w:r>
-        <w:t>WeatherData</w:t>
-      </w:r>
-      <w:proofErr w:type="spellEnd"/>
-      <w:r>
-        <w:t xml:space="preserve">. Dit zorgt er weer voor dat </w:t>
-      </w:r>
-      <w:proofErr w:type="spellStart"/>
-      <w:r>
-        <w:t>WeatherData</w:t>
-      </w:r>
-      <w:proofErr w:type="spellEnd"/>
-      <w:r>
-        <w:t xml:space="preserve"> alle </w:t>
-      </w:r>
-      <w:proofErr w:type="spellStart"/>
-      <w:r>
-        <w:t>Observers</w:t>
-      </w:r>
-      <w:proofErr w:type="spellEnd"/>
-      <w:r>
-        <w:t xml:space="preserve"> update over de veranderingen.</w:t>
+        <w:rPr>
+          <w:sz w:val="28"/>
+          <w:szCs w:val="28"/>
+        </w:rPr>
+        <w:t>Inherit met de soorten “displays” de parent class</w:t>
       </w:r>
     </w:p>
     <w:p>
       <w:pPr>
         <w:pStyle w:val="Geenafstand"/>
-      </w:pPr>
-    </w:p>
-    <w:p>
-      <w:pPr>
-        <w:pStyle w:val="Geenafstand"/>
+        <w:numPr>
+          <w:ilvl w:val="0"/>
+          <w:numId w:val="23"/>
+        </w:numPr>
+        <w:rPr>
+          <w:sz w:val="28"/>
+          <w:szCs w:val="28"/>
+        </w:rPr>
       </w:pPr>
       <w:r>
-        <w:t xml:space="preserve">Probeer ook eens een </w:t>
-      </w:r>
-      <w:proofErr w:type="spellStart"/>
-      <w:r>
-        <w:t>Observer</w:t>
-      </w:r>
-      <w:proofErr w:type="spellEnd"/>
-      <w:r>
-        <w:t xml:space="preserve"> te </w:t>
-      </w:r>
-      <w:proofErr w:type="spellStart"/>
-      <w:r>
-        <w:t>unsubscriben</w:t>
-      </w:r>
-      <w:proofErr w:type="spellEnd"/>
-      <w:r>
-        <w:t xml:space="preserve"> </w:t>
+        <w:rPr>
+          <w:sz w:val="28"/>
+          <w:szCs w:val="28"/>
+        </w:rPr>
+        <w:t>Corrigeer de definitie van de Display() methodes in de child classes</w:t>
       </w:r>
     </w:p>
     <w:p>
       <w:pPr>
         <w:pStyle w:val="Geenafstand"/>
+        <w:rPr>
+          <w:sz w:val="28"/>
+          <w:szCs w:val="28"/>
+        </w:rPr>
+      </w:pPr>
+    </w:p>
+    <w:p>
+      <w:pPr>
+        <w:pStyle w:val="Geenafstand"/>
+        <w:rPr>
+          <w:sz w:val="28"/>
+          <w:szCs w:val="28"/>
+        </w:rPr>
       </w:pPr>
     </w:p>
     <w:sectPr>
-      <w:footerReference w:type="default" r:id="rId13"/>
-      <w:footerReference w:type="first" r:id="rId14"/>
+      <w:footerReference w:type="default" r:id="rId14"/>
+      <w:footerReference w:type="first" r:id="rId15"/>
       <w:pgSz w:w="11906" w:h="16838" w:code="9"/>
       <w:pgMar w:top="1134" w:right="1134" w:bottom="2688" w:left="1134" w:header="907" w:footer="1134" w:gutter="0"/>
       <w:cols w:space="720"/>
@@ -3863,6 +4471,92 @@
     </w:lvl>
   </w:abstractNum>
   <w:abstractNum w:abstractNumId="14" w15:restartNumberingAfterBreak="0">
+    <w:nsid w:val="3F821BE2"/>
+    <w:multiLevelType w:val="hybridMultilevel"/>
+    <w:tmpl w:val="CF3E384E"/>
+    <w:lvl w:ilvl="0" w:tplc="0413000F">
+      <w:start w:val="1"/>
+      <w:numFmt w:val="decimal"/>
+      <w:lvlText w:val="%1."/>
+      <w:lvlJc w:val="left"/>
+      <w:pPr>
+        <w:ind w:left="720" w:hanging="360"/>
+      </w:pPr>
+    </w:lvl>
+    <w:lvl w:ilvl="1" w:tplc="04130019" w:tentative="1">
+      <w:start w:val="1"/>
+      <w:numFmt w:val="lowerLetter"/>
+      <w:lvlText w:val="%2."/>
+      <w:lvlJc w:val="left"/>
+      <w:pPr>
+        <w:ind w:left="1440" w:hanging="360"/>
+      </w:pPr>
+    </w:lvl>
+    <w:lvl w:ilvl="2" w:tplc="0413001B" w:tentative="1">
+      <w:start w:val="1"/>
+      <w:numFmt w:val="lowerRoman"/>
+      <w:lvlText w:val="%3."/>
+      <w:lvlJc w:val="right"/>
+      <w:pPr>
+        <w:ind w:left="2160" w:hanging="180"/>
+      </w:pPr>
+    </w:lvl>
+    <w:lvl w:ilvl="3" w:tplc="0413000F" w:tentative="1">
+      <w:start w:val="1"/>
+      <w:numFmt w:val="decimal"/>
+      <w:lvlText w:val="%4."/>
+      <w:lvlJc w:val="left"/>
+      <w:pPr>
+        <w:ind w:left="2880" w:hanging="360"/>
+      </w:pPr>
+    </w:lvl>
+    <w:lvl w:ilvl="4" w:tplc="04130019" w:tentative="1">
+      <w:start w:val="1"/>
+      <w:numFmt w:val="lowerLetter"/>
+      <w:lvlText w:val="%5."/>
+      <w:lvlJc w:val="left"/>
+      <w:pPr>
+        <w:ind w:left="3600" w:hanging="360"/>
+      </w:pPr>
+    </w:lvl>
+    <w:lvl w:ilvl="5" w:tplc="0413001B" w:tentative="1">
+      <w:start w:val="1"/>
+      <w:numFmt w:val="lowerRoman"/>
+      <w:lvlText w:val="%6."/>
+      <w:lvlJc w:val="right"/>
+      <w:pPr>
+        <w:ind w:left="4320" w:hanging="180"/>
+      </w:pPr>
+    </w:lvl>
+    <w:lvl w:ilvl="6" w:tplc="0413000F" w:tentative="1">
+      <w:start w:val="1"/>
+      <w:numFmt w:val="decimal"/>
+      <w:lvlText w:val="%7."/>
+      <w:lvlJc w:val="left"/>
+      <w:pPr>
+        <w:ind w:left="5040" w:hanging="360"/>
+      </w:pPr>
+    </w:lvl>
+    <w:lvl w:ilvl="7" w:tplc="04130019" w:tentative="1">
+      <w:start w:val="1"/>
+      <w:numFmt w:val="lowerLetter"/>
+      <w:lvlText w:val="%8."/>
+      <w:lvlJc w:val="left"/>
+      <w:pPr>
+        <w:ind w:left="5760" w:hanging="360"/>
+      </w:pPr>
+    </w:lvl>
+    <w:lvl w:ilvl="8" w:tplc="0413001B" w:tentative="1">
+      <w:start w:val="1"/>
+      <w:numFmt w:val="lowerRoman"/>
+      <w:lvlText w:val="%9."/>
+      <w:lvlJc w:val="right"/>
+      <w:pPr>
+        <w:ind w:left="6480" w:hanging="180"/>
+      </w:pPr>
+    </w:lvl>
+  </w:abstractNum>
+  <w:abstractNum w:abstractNumId="15" w15:restartNumberingAfterBreak="0">
     <w:nsid w:val="41AE69D9"/>
     <w:multiLevelType w:val="hybridMultilevel"/>
     <w:tmpl w:val="62164D06"/>
@@ -3974,7 +4668,93 @@
       </w:rPr>
     </w:lvl>
   </w:abstractNum>
-  <w:abstractNum w:abstractNumId="15" w15:restartNumberingAfterBreak="0">
+  <w:abstractNum w:abstractNumId="16" w15:restartNumberingAfterBreak="0">
+    <w:nsid w:val="5138280C"/>
+    <w:multiLevelType w:val="hybridMultilevel"/>
+    <w:tmpl w:val="07A0E342"/>
+    <w:lvl w:ilvl="0" w:tplc="04130011">
+      <w:start w:val="1"/>
+      <w:numFmt w:val="decimal"/>
+      <w:lvlText w:val="%1)"/>
+      <w:lvlJc w:val="left"/>
+      <w:pPr>
+        <w:ind w:left="720" w:hanging="360"/>
+      </w:pPr>
+    </w:lvl>
+    <w:lvl w:ilvl="1" w:tplc="FFFFFFFF" w:tentative="1">
+      <w:start w:val="1"/>
+      <w:numFmt w:val="lowerLetter"/>
+      <w:lvlText w:val="%2."/>
+      <w:lvlJc w:val="left"/>
+      <w:pPr>
+        <w:ind w:left="1440" w:hanging="360"/>
+      </w:pPr>
+    </w:lvl>
+    <w:lvl w:ilvl="2" w:tplc="FFFFFFFF" w:tentative="1">
+      <w:start w:val="1"/>
+      <w:numFmt w:val="lowerRoman"/>
+      <w:lvlText w:val="%3."/>
+      <w:lvlJc w:val="right"/>
+      <w:pPr>
+        <w:ind w:left="2160" w:hanging="180"/>
+      </w:pPr>
+    </w:lvl>
+    <w:lvl w:ilvl="3" w:tplc="FFFFFFFF" w:tentative="1">
+      <w:start w:val="1"/>
+      <w:numFmt w:val="decimal"/>
+      <w:lvlText w:val="%4."/>
+      <w:lvlJc w:val="left"/>
+      <w:pPr>
+        <w:ind w:left="2880" w:hanging="360"/>
+      </w:pPr>
+    </w:lvl>
+    <w:lvl w:ilvl="4" w:tplc="FFFFFFFF" w:tentative="1">
+      <w:start w:val="1"/>
+      <w:numFmt w:val="lowerLetter"/>
+      <w:lvlText w:val="%5."/>
+      <w:lvlJc w:val="left"/>
+      <w:pPr>
+        <w:ind w:left="3600" w:hanging="360"/>
+      </w:pPr>
+    </w:lvl>
+    <w:lvl w:ilvl="5" w:tplc="FFFFFFFF" w:tentative="1">
+      <w:start w:val="1"/>
+      <w:numFmt w:val="lowerRoman"/>
+      <w:lvlText w:val="%6."/>
+      <w:lvlJc w:val="right"/>
+      <w:pPr>
+        <w:ind w:left="4320" w:hanging="180"/>
+      </w:pPr>
+    </w:lvl>
+    <w:lvl w:ilvl="6" w:tplc="FFFFFFFF" w:tentative="1">
+      <w:start w:val="1"/>
+      <w:numFmt w:val="decimal"/>
+      <w:lvlText w:val="%7."/>
+      <w:lvlJc w:val="left"/>
+      <w:pPr>
+        <w:ind w:left="5040" w:hanging="360"/>
+      </w:pPr>
+    </w:lvl>
+    <w:lvl w:ilvl="7" w:tplc="FFFFFFFF" w:tentative="1">
+      <w:start w:val="1"/>
+      <w:numFmt w:val="lowerLetter"/>
+      <w:lvlText w:val="%8."/>
+      <w:lvlJc w:val="left"/>
+      <w:pPr>
+        <w:ind w:left="5760" w:hanging="360"/>
+      </w:pPr>
+    </w:lvl>
+    <w:lvl w:ilvl="8" w:tplc="FFFFFFFF" w:tentative="1">
+      <w:start w:val="1"/>
+      <w:numFmt w:val="lowerRoman"/>
+      <w:lvlText w:val="%9."/>
+      <w:lvlJc w:val="right"/>
+      <w:pPr>
+        <w:ind w:left="6480" w:hanging="180"/>
+      </w:pPr>
+    </w:lvl>
+  </w:abstractNum>
+  <w:abstractNum w:abstractNumId="17" w15:restartNumberingAfterBreak="0">
     <w:nsid w:val="53ED7BAA"/>
     <w:multiLevelType w:val="hybridMultilevel"/>
     <w:tmpl w:val="21D658D8"/>
@@ -4086,7 +4866,7 @@
       </w:rPr>
     </w:lvl>
   </w:abstractNum>
-  <w:abstractNum w:abstractNumId="16" w15:restartNumberingAfterBreak="0">
+  <w:abstractNum w:abstractNumId="18" w15:restartNumberingAfterBreak="0">
     <w:nsid w:val="54754F5F"/>
     <w:multiLevelType w:val="hybridMultilevel"/>
     <w:tmpl w:val="5372A3A8"/>
@@ -4172,7 +4952,7 @@
       </w:pPr>
     </w:lvl>
   </w:abstractNum>
-  <w:abstractNum w:abstractNumId="17" w15:restartNumberingAfterBreak="0">
+  <w:abstractNum w:abstractNumId="19" w15:restartNumberingAfterBreak="0">
     <w:nsid w:val="593A4EA6"/>
     <w:multiLevelType w:val="hybridMultilevel"/>
     <w:tmpl w:val="6A62C320"/>
@@ -4258,7 +5038,7 @@
       </w:pPr>
     </w:lvl>
   </w:abstractNum>
-  <w:abstractNum w:abstractNumId="18" w15:restartNumberingAfterBreak="0">
+  <w:abstractNum w:abstractNumId="20" w15:restartNumberingAfterBreak="0">
     <w:nsid w:val="6B382227"/>
     <w:multiLevelType w:val="hybridMultilevel"/>
     <w:tmpl w:val="B086B794"/>
@@ -4344,7 +5124,7 @@
       </w:pPr>
     </w:lvl>
   </w:abstractNum>
-  <w:abstractNum w:abstractNumId="19" w15:restartNumberingAfterBreak="0">
+  <w:abstractNum w:abstractNumId="21" w15:restartNumberingAfterBreak="0">
     <w:nsid w:val="797B3BD6"/>
     <w:multiLevelType w:val="hybridMultilevel"/>
     <w:tmpl w:val="E7E4BFF2"/>
@@ -4464,7 +5244,7 @@
     <w:abstractNumId w:val="4"/>
   </w:num>
   <w:num w:numId="3" w16cid:durableId="486243713">
-    <w:abstractNumId w:val="19"/>
+    <w:abstractNumId w:val="21"/>
   </w:num>
   <w:num w:numId="4" w16cid:durableId="1112867458">
     <w:abstractNumId w:val="7"/>
@@ -4473,7 +5253,7 @@
     <w:abstractNumId w:val="3"/>
   </w:num>
   <w:num w:numId="6" w16cid:durableId="224486430">
-    <w:abstractNumId w:val="14"/>
+    <w:abstractNumId w:val="15"/>
   </w:num>
   <w:num w:numId="7" w16cid:durableId="1746295215">
     <w:abstractNumId w:val="8"/>
@@ -4482,10 +5262,10 @@
     <w:abstractNumId w:val="5"/>
   </w:num>
   <w:num w:numId="9" w16cid:durableId="86078648">
-    <w:abstractNumId w:val="15"/>
+    <w:abstractNumId w:val="17"/>
   </w:num>
   <w:num w:numId="10" w16cid:durableId="2116170924">
-    <w:abstractNumId w:val="16"/>
+    <w:abstractNumId w:val="18"/>
   </w:num>
   <w:num w:numId="11" w16cid:durableId="47537649">
     <w:abstractNumId w:val="11"/>
@@ -4506,10 +5286,10 @@
     <w:abstractNumId w:val="12"/>
   </w:num>
   <w:num w:numId="16" w16cid:durableId="99566210">
-    <w:abstractNumId w:val="17"/>
+    <w:abstractNumId w:val="19"/>
   </w:num>
   <w:num w:numId="17" w16cid:durableId="1273048446">
-    <w:abstractNumId w:val="18"/>
+    <w:abstractNumId w:val="20"/>
   </w:num>
   <w:num w:numId="18" w16cid:durableId="381907739">
     <w:abstractNumId w:val="9"/>
@@ -4522,6 +5302,12 @@
   </w:num>
   <w:num w:numId="21" w16cid:durableId="1073702862">
     <w:abstractNumId w:val="6"/>
+  </w:num>
+  <w:num w:numId="22" w16cid:durableId="2129542552">
+    <w:abstractNumId w:val="14"/>
+  </w:num>
+  <w:num w:numId="23" w16cid:durableId="2094861222">
+    <w:abstractNumId w:val="16"/>
   </w:num>
 </w:numbering>
 </file>
@@ -6198,31 +6984,6 @@
 </file>
 
 <file path=customXml/item1.xml><?xml version="1.0" encoding="utf-8"?>
-<?mso-contentType ?>
-<FormTemplates xmlns="http://schemas.microsoft.com/sharepoint/v3/contenttype/forms">
-  <Display>DocumentLibraryForm</Display>
-  <Edit>DocumentLibraryForm</Edit>
-  <New>DocumentLibraryForm</New>
-</FormTemplates>
-</file>
-
-<file path=customXml/item2.xml><?xml version="1.0" encoding="utf-8"?>
-<p:properties xmlns:p="http://schemas.microsoft.com/office/2006/metadata/properties" xmlns:xsi="http://www.w3.org/2001/XMLSchema-instance" xmlns:pc="http://schemas.microsoft.com/office/infopath/2007/PartnerControls">
-  <documentManagement>
-    <lcf76f155ced4ddcb4097134ff3c332f xmlns="bd273f67-5965-45f0-ac4e-d17ce83175e7">
-      <Terms xmlns="http://schemas.microsoft.com/office/infopath/2007/PartnerControls"/>
-    </lcf76f155ced4ddcb4097134ff3c332f>
-    <TaxCatchAll xmlns="e1a4e582-16c8-4a73-92d0-82596f5157ed" xsi:nil="true"/>
-  </documentManagement>
-</p:properties>
-</file>
-
-<file path=customXml/item3.xml><?xml version="1.0" encoding="utf-8"?>
-<?mso-contentType ?>
-<SharedContentType xmlns="Microsoft.SharePoint.Taxonomy.ContentTypeSync" SourceId="96173d46-5f7d-49bf-a64d-4dd4f1c458b8" ContentTypeId="0x0101" PreviousValue="false"/>
-</file>
-
-<file path=customXml/item4.xml><?xml version="1.0" encoding="utf-8"?>
 <ct:contentTypeSchema xmlns:ct="http://schemas.microsoft.com/office/2006/metadata/contentType" xmlns:ma="http://schemas.microsoft.com/office/2006/metadata/properties/metaAttributes" ct:_="" ma:_="" ma:contentTypeName="Document" ma:contentTypeID="0x0101001E178663C6C1154FBF9CBC32AA8D1BC4" ma:contentTypeVersion="21" ma:contentTypeDescription="Een nieuw document maken." ma:contentTypeScope="" ma:versionID="af21f877df13d820d55115ad741f709a">
   <xsd:schema xmlns:xsd="http://www.w3.org/2001/XMLSchema" xmlns:xs="http://www.w3.org/2001/XMLSchema" xmlns:p="http://schemas.microsoft.com/office/2006/metadata/properties" xmlns:ns2="bd273f67-5965-45f0-ac4e-d17ce83175e7" xmlns:ns3="e1a4e582-16c8-4a73-92d0-82596f5157ed" targetNamespace="http://schemas.microsoft.com/office/2006/metadata/properties" ma:root="true" ma:fieldsID="47e38de87ba9e1a228e235d6d59dcf6f" ns2:_="" ns3:_="">
     <xsd:import namespace="bd273f67-5965-45f0-ac4e-d17ce83175e7"/>
@@ -6471,38 +7232,36 @@
 </ct:contentTypeSchema>
 </file>
 
+<file path=customXml/item2.xml><?xml version="1.0" encoding="utf-8"?>
+<?mso-contentType ?>
+<SharedContentType xmlns="Microsoft.SharePoint.Taxonomy.ContentTypeSync" SourceId="96173d46-5f7d-49bf-a64d-4dd4f1c458b8" ContentTypeId="0x0101" PreviousValue="false"/>
+</file>
+
+<file path=customXml/item3.xml><?xml version="1.0" encoding="utf-8"?>
+<p:properties xmlns:p="http://schemas.microsoft.com/office/2006/metadata/properties" xmlns:xsi="http://www.w3.org/2001/XMLSchema-instance" xmlns:pc="http://schemas.microsoft.com/office/infopath/2007/PartnerControls">
+  <documentManagement>
+    <lcf76f155ced4ddcb4097134ff3c332f xmlns="bd273f67-5965-45f0-ac4e-d17ce83175e7">
+      <Terms xmlns="http://schemas.microsoft.com/office/infopath/2007/PartnerControls"/>
+    </lcf76f155ced4ddcb4097134ff3c332f>
+    <TaxCatchAll xmlns="e1a4e582-16c8-4a73-92d0-82596f5157ed" xsi:nil="true"/>
+  </documentManagement>
+</p:properties>
+</file>
+
+<file path=customXml/item4.xml><?xml version="1.0" encoding="utf-8"?>
+<?mso-contentType ?>
+<FormTemplates xmlns="http://schemas.microsoft.com/sharepoint/v3/contenttype/forms">
+  <Display>DocumentLibraryForm</Display>
+  <Edit>DocumentLibraryForm</Edit>
+  <New>DocumentLibraryForm</New>
+</FormTemplates>
+</file>
+
 <file path=customXml/item5.xml><?xml version="1.0" encoding="utf-8"?>
 <b:Sources xmlns:b="http://schemas.openxmlformats.org/officeDocument/2006/bibliography" xmlns="http://schemas.openxmlformats.org/officeDocument/2006/bibliography" SelectedStyle="/APASixthEditionOfficeOnline.xsl" StyleName="APA" Version="6"/>
 </file>
 
 <file path=customXml/itemProps1.xml><?xml version="1.0" encoding="utf-8"?>
-<ds:datastoreItem xmlns:ds="http://schemas.openxmlformats.org/officeDocument/2006/customXml" ds:itemID="{A25B3578-7C9B-41F5-A14A-14B3F302CC6A}">
-  <ds:schemaRefs>
-    <ds:schemaRef ds:uri="http://schemas.microsoft.com/sharepoint/v3/contenttype/forms"/>
-  </ds:schemaRefs>
-</ds:datastoreItem>
-</file>
-
-<file path=customXml/itemProps2.xml><?xml version="1.0" encoding="utf-8"?>
-<ds:datastoreItem xmlns:ds="http://schemas.openxmlformats.org/officeDocument/2006/customXml" ds:itemID="{A252A040-BE62-4C1B-9842-E4DC60FDA318}">
-  <ds:schemaRefs>
-    <ds:schemaRef ds:uri="http://schemas.microsoft.com/office/2006/metadata/properties"/>
-    <ds:schemaRef ds:uri="http://schemas.microsoft.com/office/infopath/2007/PartnerControls"/>
-    <ds:schemaRef ds:uri="bd273f67-5965-45f0-ac4e-d17ce83175e7"/>
-    <ds:schemaRef ds:uri="e1a4e582-16c8-4a73-92d0-82596f5157ed"/>
-  </ds:schemaRefs>
-</ds:datastoreItem>
-</file>
-
-<file path=customXml/itemProps3.xml><?xml version="1.0" encoding="utf-8"?>
-<ds:datastoreItem xmlns:ds="http://schemas.openxmlformats.org/officeDocument/2006/customXml" ds:itemID="{C036E063-0501-4A91-AF28-5142A9D2AD7E}">
-  <ds:schemaRefs>
-    <ds:schemaRef ds:uri="Microsoft.SharePoint.Taxonomy.ContentTypeSync"/>
-  </ds:schemaRefs>
-</ds:datastoreItem>
-</file>
-
-<file path=customXml/itemProps4.xml><?xml version="1.0" encoding="utf-8"?>
 <ds:datastoreItem xmlns:ds="http://schemas.openxmlformats.org/officeDocument/2006/customXml" ds:itemID="{28266C3C-155C-4F4B-A0B7-13BFC8DCA7C4}">
   <ds:schemaRefs>
     <ds:schemaRef ds:uri="http://schemas.microsoft.com/office/2006/metadata/contentType"/>
@@ -6521,6 +7280,33 @@
 </ds:datastoreItem>
 </file>
 
+<file path=customXml/itemProps2.xml><?xml version="1.0" encoding="utf-8"?>
+<ds:datastoreItem xmlns:ds="http://schemas.openxmlformats.org/officeDocument/2006/customXml" ds:itemID="{C036E063-0501-4A91-AF28-5142A9D2AD7E}">
+  <ds:schemaRefs>
+    <ds:schemaRef ds:uri="Microsoft.SharePoint.Taxonomy.ContentTypeSync"/>
+  </ds:schemaRefs>
+</ds:datastoreItem>
+</file>
+
+<file path=customXml/itemProps3.xml><?xml version="1.0" encoding="utf-8"?>
+<ds:datastoreItem xmlns:ds="http://schemas.openxmlformats.org/officeDocument/2006/customXml" ds:itemID="{A252A040-BE62-4C1B-9842-E4DC60FDA318}">
+  <ds:schemaRefs>
+    <ds:schemaRef ds:uri="http://schemas.microsoft.com/office/2006/metadata/properties"/>
+    <ds:schemaRef ds:uri="http://schemas.microsoft.com/office/infopath/2007/PartnerControls"/>
+    <ds:schemaRef ds:uri="bd273f67-5965-45f0-ac4e-d17ce83175e7"/>
+    <ds:schemaRef ds:uri="e1a4e582-16c8-4a73-92d0-82596f5157ed"/>
+  </ds:schemaRefs>
+</ds:datastoreItem>
+</file>
+
+<file path=customXml/itemProps4.xml><?xml version="1.0" encoding="utf-8"?>
+<ds:datastoreItem xmlns:ds="http://schemas.openxmlformats.org/officeDocument/2006/customXml" ds:itemID="{A25B3578-7C9B-41F5-A14A-14B3F302CC6A}">
+  <ds:schemaRefs>
+    <ds:schemaRef ds:uri="http://schemas.microsoft.com/sharepoint/v3/contenttype/forms"/>
+  </ds:schemaRefs>
+</ds:datastoreItem>
+</file>
+
 <file path=customXml/itemProps5.xml><?xml version="1.0" encoding="utf-8"?>
 <ds:datastoreItem xmlns:ds="http://schemas.openxmlformats.org/officeDocument/2006/customXml" ds:itemID="{6EC07A6A-086E-6045-A911-CB4E4D508AFB}">
   <ds:schemaRefs>

</xml_diff>